<commit_message>
Added enforce_airspace toggle to missions and fix AUTO start waypoint
Missions can now disable government airspace zone enforcement, which
suppresses breach-triggered auto-RTL while keeping the fence armed for
visualization. Also force mission_set_current to seq 1 on upload so
switching to AUTO flies to the first waypoint instead of loitering at
whatever item the autopilot last had current.
</commit_message>
<xml_diff>
--- a/backend/app/tests/reports/modules/test_mission_deconfliction_documentation.docx
+++ b/backend/app/tests/reports/modules/test_mission_deconfliction_documentation.docx
@@ -12,17 +12,17 @@
     </w:p>
     <w:p>
       <w:r>
-        <w:t>Generated at: 2026-07-10T05:02:00+00:00</w:t>
+        <w:t>Generated at: 2026-08-18T14:34:23+00:00</w:t>
       </w:r>
     </w:p>
     <w:p>
       <w:r>
-        <w:t>Test session started: 2026-07-10T04:58:46+00:00</w:t>
+        <w:t>Test session started: 2026-08-18T14:32:25+00:00</w:t>
       </w:r>
     </w:p>
     <w:p>
       <w:r>
-        <w:t>Pytest exit status: 1</w:t>
+        <w:t>Pytest exit status: 0</w:t>
       </w:r>
     </w:p>
     <w:p>
@@ -348,7 +348,7 @@
           </w:tcPr>
           <w:p>
             <w:r>
-              <w:t>0.012</w:t>
+              <w:t>0.126</w:t>
             </w:r>
           </w:p>
         </w:tc>
@@ -420,7 +420,7 @@
           </w:tcPr>
           <w:p>
             <w:r>
-              <w:t>0.013</w:t>
+              <w:t>0.206</w:t>
             </w:r>
           </w:p>
         </w:tc>
@@ -492,7 +492,7 @@
           </w:tcPr>
           <w:p>
             <w:r>
-              <w:t>0.012</w:t>
+              <w:t>0.026</w:t>
             </w:r>
           </w:p>
         </w:tc>
@@ -564,7 +564,7 @@
           </w:tcPr>
           <w:p>
             <w:r>
-              <w:t>0.011</w:t>
+              <w:t>0.042</w:t>
             </w:r>
           </w:p>
         </w:tc>
@@ -636,7 +636,7 @@
           </w:tcPr>
           <w:p>
             <w:r>
-              <w:t>0.016</w:t>
+              <w:t>0.062</w:t>
             </w:r>
           </w:p>
         </w:tc>
@@ -708,7 +708,7 @@
           </w:tcPr>
           <w:p>
             <w:r>
-              <w:t>0.021</w:t>
+              <w:t>41.915</w:t>
             </w:r>
           </w:p>
         </w:tc>
@@ -780,7 +780,7 @@
           </w:tcPr>
           <w:p>
             <w:r>
-              <w:t>0.017</w:t>
+              <w:t>0.036</w:t>
             </w:r>
           </w:p>
         </w:tc>
@@ -852,7 +852,7 @@
           </w:tcPr>
           <w:p>
             <w:r>
-              <w:t>0.023</w:t>
+              <w:t>0.038</w:t>
             </w:r>
           </w:p>
         </w:tc>
@@ -924,7 +924,7 @@
           </w:tcPr>
           <w:p>
             <w:r>
-              <w:t>0.012</w:t>
+              <w:t>0.040</w:t>
             </w:r>
           </w:p>
         </w:tc>
@@ -996,7 +996,7 @@
           </w:tcPr>
           <w:p>
             <w:r>
-              <w:t>0.013</w:t>
+              <w:t>0.062</w:t>
             </w:r>
           </w:p>
         </w:tc>
@@ -1038,37 +1038,37 @@
           </w:tcPr>
           <w:p>
             <w:r>
-              <w:t>test_approve_conflict_with_executing_mission</w:t>
-            </w:r>
-          </w:p>
-        </w:tc>
-        <w:tc>
-          <w:tcPr>
-            <w:tcW w:w="2400" w:type="dxa"/>
-          </w:tcPr>
-          <w:p>
-            <w:r>
-              <w:t>An "executing" mission is also active — approval of an overlapping | mission must still return 409.</w:t>
-            </w:r>
-          </w:p>
-        </w:tc>
-        <w:tc>
-          <w:tcPr>
-            <w:tcW w:w="2400" w:type="dxa"/>
-          </w:tcPr>
-          <w:p>
-            <w:r>
-              <w:t>Passed</w:t>
-            </w:r>
-          </w:p>
-        </w:tc>
-        <w:tc>
-          <w:tcPr>
-            <w:tcW w:w="2400" w:type="dxa"/>
-          </w:tcPr>
-          <w:p>
-            <w:r>
-              <w:t>0.321</w:t>
+              <w:t>test_approve_mission_not_found_returns_404</w:t>
+            </w:r>
+          </w:p>
+        </w:tc>
+        <w:tc>
+          <w:tcPr>
+            <w:tcW w:w="2400" w:type="dxa"/>
+          </w:tcPr>
+          <w:p>
+            <w:r>
+              <w:t>PATCH on a non-existent mission must return 404.</w:t>
+            </w:r>
+          </w:p>
+        </w:tc>
+        <w:tc>
+          <w:tcPr>
+            <w:tcW w:w="2400" w:type="dxa"/>
+          </w:tcPr>
+          <w:p>
+            <w:r>
+              <w:t>Passed</w:t>
+            </w:r>
+          </w:p>
+        </w:tc>
+        <w:tc>
+          <w:tcPr>
+            <w:tcW w:w="2400" w:type="dxa"/>
+          </w:tcPr>
+          <w:p>
+            <w:r>
+              <w:t>1.176</w:t>
             </w:r>
           </w:p>
         </w:tc>
@@ -1110,37 +1110,37 @@
           </w:tcPr>
           <w:p>
             <w:r>
-              <w:t>test_approve_mission_not_found_returns_404</w:t>
-            </w:r>
-          </w:p>
-        </w:tc>
-        <w:tc>
-          <w:tcPr>
-            <w:tcW w:w="2400" w:type="dxa"/>
-          </w:tcPr>
-          <w:p>
-            <w:r>
-              <w:t>PATCH on a non-existent mission must return 404.</w:t>
-            </w:r>
-          </w:p>
-        </w:tc>
-        <w:tc>
-          <w:tcPr>
-            <w:tcW w:w="2400" w:type="dxa"/>
-          </w:tcPr>
-          <w:p>
-            <w:r>
-              <w:t>Passed</w:t>
-            </w:r>
-          </w:p>
-        </w:tc>
-        <w:tc>
-          <w:tcPr>
-            <w:tcW w:w="2400" w:type="dxa"/>
-          </w:tcPr>
-          <w:p>
-            <w:r>
-              <w:t>0.303</w:t>
+              <w:t>test_approve_no_conflict_returns_200</w:t>
+            </w:r>
+          </w:p>
+        </w:tc>
+        <w:tc>
+          <w:tcPr>
+            <w:tcW w:w="2400" w:type="dxa"/>
+          </w:tcPr>
+          <w:p>
+            <w:r>
+              <w:t>Approving a mission with no active conflicts must return 200.</w:t>
+            </w:r>
+          </w:p>
+        </w:tc>
+        <w:tc>
+          <w:tcPr>
+            <w:tcW w:w="2400" w:type="dxa"/>
+          </w:tcPr>
+          <w:p>
+            <w:r>
+              <w:t>Passed</w:t>
+            </w:r>
+          </w:p>
+        </w:tc>
+        <w:tc>
+          <w:tcPr>
+            <w:tcW w:w="2400" w:type="dxa"/>
+          </w:tcPr>
+          <w:p>
+            <w:r>
+              <w:t>10.278</w:t>
             </w:r>
           </w:p>
         </w:tc>
@@ -1182,37 +1182,37 @@
           </w:tcPr>
           <w:p>
             <w:r>
-              <w:t>test_approve_no_conflict_returns_200</w:t>
-            </w:r>
-          </w:p>
-        </w:tc>
-        <w:tc>
-          <w:tcPr>
-            <w:tcW w:w="2400" w:type="dxa"/>
-          </w:tcPr>
-          <w:p>
-            <w:r>
-              <w:t>Approving a mission with no active conflicts must return 200.</w:t>
-            </w:r>
-          </w:p>
-        </w:tc>
-        <w:tc>
-          <w:tcPr>
-            <w:tcW w:w="2400" w:type="dxa"/>
-          </w:tcPr>
-          <w:p>
-            <w:r>
-              <w:t>Passed</w:t>
-            </w:r>
-          </w:p>
-        </w:tc>
-        <w:tc>
-          <w:tcPr>
-            <w:tcW w:w="2400" w:type="dxa"/>
-          </w:tcPr>
-          <w:p>
-            <w:r>
-              <w:t>0.326</w:t>
+              <w:t>test_approve_overlap_with_executing_mission_still_succeeds</w:t>
+            </w:r>
+          </w:p>
+        </w:tc>
+        <w:tc>
+          <w:tcPr>
+            <w:tcW w:w="2400" w:type="dxa"/>
+          </w:tcPr>
+          <w:p>
+            <w:r>
+              <w:t>An "executing" mission overlapping the one being approved must not | block approval either — same rule as an "approved" overlap.</w:t>
+            </w:r>
+          </w:p>
+        </w:tc>
+        <w:tc>
+          <w:tcPr>
+            <w:tcW w:w="2400" w:type="dxa"/>
+          </w:tcPr>
+          <w:p>
+            <w:r>
+              <w:t>Passed</w:t>
+            </w:r>
+          </w:p>
+        </w:tc>
+        <w:tc>
+          <w:tcPr>
+            <w:tcW w:w="2400" w:type="dxa"/>
+          </w:tcPr>
+          <w:p>
+            <w:r>
+              <w:t>1.680</w:t>
             </w:r>
           </w:p>
         </w:tc>
@@ -1284,7 +1284,7 @@
           </w:tcPr>
           <w:p>
             <w:r>
-              <w:t>0.313</w:t>
+              <w:t>3.095</w:t>
             </w:r>
           </w:p>
         </w:tc>
@@ -1356,7 +1356,7 @@
           </w:tcPr>
           <w:p>
             <w:r>
-              <w:t>0.334</w:t>
+              <w:t>0.707</w:t>
             </w:r>
           </w:p>
         </w:tc>
@@ -1398,37 +1398,37 @@
           </w:tcPr>
           <w:p>
             <w:r>
-              <w:t>test_approve_with_conflict_returns_409</w:t>
-            </w:r>
-          </w:p>
-        </w:tc>
-        <w:tc>
-          <w:tcPr>
-            <w:tcW w:w="2400" w:type="dxa"/>
-          </w:tcPr>
-          <w:p>
-            <w:r>
-              <w:t>Approving a mission whose convex hull overlaps an already-approved | mission must return 409 with a conflict list.</w:t>
-            </w:r>
-          </w:p>
-        </w:tc>
-        <w:tc>
-          <w:tcPr>
-            <w:tcW w:w="2400" w:type="dxa"/>
-          </w:tcPr>
-          <w:p>
-            <w:r>
-              <w:t>Passed</w:t>
-            </w:r>
-          </w:p>
-        </w:tc>
-        <w:tc>
-          <w:tcPr>
-            <w:tcW w:w="2400" w:type="dxa"/>
-          </w:tcPr>
-          <w:p>
-            <w:r>
-              <w:t>0.325</w:t>
+              <w:t>test_approve_with_overlap_still_succeeds</w:t>
+            </w:r>
+          </w:p>
+        </w:tc>
+        <w:tc>
+          <w:tcPr>
+            <w:tcW w:w="2400" w:type="dxa"/>
+          </w:tcPr>
+          <w:p>
+            <w:r>
+              <w:t>Mission approval is never blocked by another mission's overlapping | route — cross-mission scheduling is an operator judgment call, not | a system-enforced veto. Only real government-restricted airspace | (gated by Mission.enforce_airspace) can block approval-adjacent flows.</w:t>
+            </w:r>
+          </w:p>
+        </w:tc>
+        <w:tc>
+          <w:tcPr>
+            <w:tcW w:w="2400" w:type="dxa"/>
+          </w:tcPr>
+          <w:p>
+            <w:r>
+              <w:t>Passed</w:t>
+            </w:r>
+          </w:p>
+        </w:tc>
+        <w:tc>
+          <w:tcPr>
+            <w:tcW w:w="2400" w:type="dxa"/>
+          </w:tcPr>
+          <w:p>
+            <w:r>
+              <w:t>0.529</w:t>
             </w:r>
           </w:p>
         </w:tc>
@@ -1500,7 +1500,7 @@
           </w:tcPr>
           <w:p>
             <w:r>
-              <w:t>0.324</w:t>
+              <w:t>0.956</w:t>
             </w:r>
           </w:p>
         </w:tc>

</xml_diff>